<commit_message>
feat(inbox/aan): Book 03 Certificates & Tokens briefing deck + figure write-back
New 26-slide Book 03 briefing per the series authoring spec: FedRAMP
Moderate only, Date Code on title + all footers, full sourced speaker
notes, four build sequences (three Kerberos bindings 3-step, PKI as
naming-plane function 3-step, token anatomy 3-step, workload identity
2-step, phased implementation 2-step). Deck deployed to OneDrive.

Spec section 4 write-back (3 augments; 5 existing ct-figs cover the
rest as skips):
- ct-fig-06 internal trust hierarchy — Trust Hierarchy section had no
  figure
- ct-fig-07 token anatomy / refresh-token policy gate — Token Layer
  section had no figure
- ct-fig-08 four implementation phases with gates — Phased
  Implementation section had no figure
Book Date Code 2026-07-07 10:36 ET; docx re-rendered from qmd.

Co-Authored-By: Claude Fable 5 <noreply@anthropic.com>
</commit_message>
<xml_diff>
--- a/inbox/Application Aware Networking/Book_03_FedAAN_Certificates_Tokens_Cryptographic_Identity.docx
+++ b/inbox/Application Aware Networking/Book_03_FedAAN_Certificates_Tokens_Cryptographic_Identity.docx
@@ -31,7 +31,7 @@
         <w:pStyle w:val="Date"/>
       </w:pPr>
       <w:r>
-        <w:t xml:space="preserve">2026-07-06</w:t>
+        <w:t xml:space="preserve">Invalid Date</w:t>
       </w:r>
     </w:p>
     <w:sdt>
@@ -114,7 +114,7 @@
                     <a:graphicData uri="http://schemas.openxmlformats.org/drawingml/2006/picture">
                       <pic:pic>
                         <pic:nvPicPr>
-                          <pic:cNvPr descr="/opt/quarto/share/formats/docx/warning.png" id="11" name="Picture"/>
+                          <pic:cNvPr descr="C:\Program Files\Quarto\share\formats\docx\warning.png" id="11" name="Picture"/>
                           <pic:cNvPicPr>
                             <a:picLocks noChangeArrowheads="1" noChangeAspect="1"/>
                           </pic:cNvPicPr>
@@ -174,7 +174,7 @@
               <w:pStyle w:val="BodyText"/>
             </w:pPr>
             <w:pPr>
-              <w:spacing w:before="16" w:after="16"/>
+              <w:spacing w:before="16"/>
             </w:pPr>
             <w:r>
               <w:t xml:space="preserve">This document is a</w:t>
@@ -207,6 +207,27 @@
             </w:r>
             <w:r>
               <w:t xml:space="preserve">. It is an attempt at a comprehensive SSA-wide technical roadmap and has not been reviewed or approved by the SSA CIO Office, the Office of Information Security (OIS), or organizational leadership. All recommendations, vendor selections, control mappings, and implementation timelines are subject to revision pending formal review by the SSA CIO Office and organizational components.</w:t>
+            </w:r>
+          </w:p>
+          <w:p>
+            <w:pPr>
+              <w:pStyle w:val="BodyText"/>
+            </w:pPr>
+            <w:pPr>
+              <w:spacing w:after="16"/>
+            </w:pPr>
+            <w:r>
+              <w:rPr>
+                <w:b/>
+                <w:bCs/>
+              </w:rPr>
+              <w:t xml:space="preserve">Date Code:</w:t>
+            </w:r>
+            <w:r>
+              <w:t xml:space="preserve"> </w:t>
+            </w:r>
+            <w:r>
+              <w:t xml:space="preserve">2026-07-07 10:36 ET</w:t>
             </w:r>
           </w:p>
           <w:p/>
@@ -267,7 +288,7 @@
                     <a:graphicData uri="http://schemas.openxmlformats.org/drawingml/2006/picture">
                       <pic:pic>
                         <pic:nvPicPr>
-                          <pic:cNvPr descr="/opt/quarto/share/formats/docx/important.png" id="14" name="Picture"/>
+                          <pic:cNvPr descr="C:\Program Files\Quarto\share\formats\docx\important.png" id="14" name="Picture"/>
                           <pic:cNvPicPr>
                             <a:picLocks noChangeArrowheads="1" noChangeAspect="1"/>
                           </pic:cNvPicPr>
@@ -823,7 +844,7 @@
                     <a:graphicData uri="http://schemas.openxmlformats.org/drawingml/2006/picture">
                       <pic:pic>
                         <pic:nvPicPr>
-                          <pic:cNvPr descr="/opt/quarto/share/formats/docx/note.png" id="21" name="Picture"/>
+                          <pic:cNvPr descr="C:\Program Files\Quarto\share\formats\docx\note.png" id="21" name="Picture"/>
                           <pic:cNvPicPr>
                             <a:picLocks noChangeArrowheads="1" noChangeAspect="1"/>
                           </pic:cNvPicPr>
@@ -986,7 +1007,7 @@
                     <a:graphicData uri="http://schemas.openxmlformats.org/drawingml/2006/picture">
                       <pic:pic>
                         <pic:nvPicPr>
-                          <pic:cNvPr descr="/opt/quarto/share/formats/docx/note.png" id="23" name="Picture"/>
+                          <pic:cNvPr descr="C:\Program Files\Quarto\share\formats\docx\note.png" id="23" name="Picture"/>
                           <pic:cNvPicPr>
                             <a:picLocks noChangeArrowheads="1" noChangeAspect="1"/>
                           </pic:cNvPicPr>
@@ -2153,7 +2174,7 @@
     </w:p>
     <w:bookmarkEnd w:id="34"/>
     <w:bookmarkEnd w:id="35"/>
-    <w:bookmarkStart w:id="45" w:name="pki-as-a-naming-plane-function"/>
+    <w:bookmarkStart w:id="49" w:name="pki-as-a-naming-plane-function"/>
     <w:p>
       <w:pPr>
         <w:pStyle w:val="Heading1"/>
@@ -2726,7 +2747,7 @@
                     <a:graphicData uri="http://schemas.openxmlformats.org/drawingml/2006/picture">
                       <pic:pic>
                         <pic:nvPicPr>
-                          <pic:cNvPr descr="/opt/quarto/share/formats/docx/note.png" id="42" name="Picture"/>
+                          <pic:cNvPr descr="C:\Program Files\Quarto\share\formats\docx\note.png" id="42" name="Picture"/>
                           <pic:cNvPicPr>
                             <a:picLocks noChangeArrowheads="1" noChangeAspect="1"/>
                           </pic:cNvPicPr>
@@ -2920,7 +2941,7 @@
       </w:tr>
     </w:tbl>
     <w:bookmarkEnd w:id="43"/>
-    <w:bookmarkStart w:id="44" w:name="the-internal-trust-hierarchy"/>
+    <w:bookmarkStart w:id="48" w:name="the-internal-trust-hierarchy"/>
     <w:p>
       <w:pPr>
         <w:pStyle w:val="Heading2"/>
@@ -3299,206 +3320,10 @@
     </w:tbl>
     <w:p>
       <w:pPr>
-        <w:pStyle w:val="BlockText"/>
-      </w:pPr>
-      <w:r>
-        <w:rPr>
-          <w:b/>
-          <w:bCs/>
-        </w:rPr>
-        <w:t xml:space="preserve">Closure Necessity — SC-17 certificate issuance under policy.</w:t>
-      </w:r>
-      <w:r>
-        <w:t xml:space="preserve"> </w:t>
-      </w:r>
-      <w:r>
-        <w:t xml:space="preserve">SC-17 requires certificates to be issued under an organization-defined certificate policy and requires trust stores to contain only approved trust anchors. A written certificate policy constrains no one at the moment of issuance; the only machine-enforced expression of issuance policy is the CAA record in the authoritative zone, checked by protocol at every public issuance, paired with an internal CA whose enrollment gates (SCEP/EST/ACME) execute against the same authoritative naming plane. There is no scanner, memo, or procurement clause that prevents an unauthorized issuance after the fact — only the naming plane can refuse it before the fact.</w:t>
-      </w:r>
-    </w:p>
-    <w:bookmarkEnd w:id="44"/>
-    <w:bookmarkEnd w:id="45"/>
-    <w:bookmarkStart w:id="58" w:name="X5640bec4ca7d998923d0137acff7faca70a4b04"/>
-    <w:p>
-      <w:pPr>
-        <w:pStyle w:val="Heading1"/>
-      </w:pPr>
-      <w:r>
-        <w:t xml:space="preserve">4. Certificate Lifecycle Automation — The End of the Spreadsheet CA</w:t>
-      </w:r>
-    </w:p>
-    <w:bookmarkStart w:id="46" w:name="the-failure-mode-being-retired"/>
-    <w:p>
-      <w:pPr>
-        <w:pStyle w:val="Heading2"/>
-      </w:pPr>
-      <w:r>
-        <w:t xml:space="preserve">4.1 The Failure Mode Being Retired</w:t>
-      </w:r>
-    </w:p>
-    <w:p>
-      <w:pPr>
-        <w:pStyle w:val="FirstParagraph"/>
-      </w:pPr>
-      <w:r>
-        <w:t xml:space="preserve">The legacy operating model for federal certificate management is a spreadsheet: a list of certificates, expiry dates, owning contacts, and renewal reminders maintained by hand. Its failure modes are so uniform they are practically a curriculum:</w:t>
-      </w:r>
-    </w:p>
-    <w:p>
-      <w:pPr>
-        <w:pStyle w:val="Compact"/>
-        <w:numPr>
-          <w:ilvl w:val="0"/>
-          <w:numId w:val="1008"/>
-        </w:numPr>
-      </w:pPr>
-      <w:r>
-        <w:rPr>
-          <w:b/>
-          <w:bCs/>
-        </w:rPr>
-        <w:t xml:space="preserve">The expiry outage.</w:t>
-      </w:r>
-      <w:r>
-        <w:t xml:space="preserve"> </w:t>
-      </w:r>
-      <w:r>
-        <w:t xml:space="preserve">A certificate expires because the reminder went to a departed employee’s mailbox. The application fails closed at 2 a.m. The post-incident action item is a better spreadsheet.</w:t>
-      </w:r>
-    </w:p>
-    <w:p>
-      <w:pPr>
-        <w:pStyle w:val="Compact"/>
-        <w:numPr>
-          <w:ilvl w:val="0"/>
-          <w:numId w:val="1008"/>
-        </w:numPr>
-      </w:pPr>
-      <w:r>
-        <w:rPr>
-          <w:b/>
-          <w:bCs/>
-        </w:rPr>
-        <w:t xml:space="preserve">The unknown certificate.</w:t>
-      </w:r>
-      <w:r>
-        <w:t xml:space="preserve"> </w:t>
-      </w:r>
-      <w:r>
-        <w:t xml:space="preserve">A scan finds a certificate on a production listener that appears in no inventory. Nobody knows which CA issued it, who holds the private key, or what breaks if it is revoked. It is left alone, which is the worst available answer.</w:t>
-      </w:r>
-    </w:p>
-    <w:p>
-      <w:pPr>
-        <w:pStyle w:val="Compact"/>
-        <w:numPr>
-          <w:ilvl w:val="0"/>
-          <w:numId w:val="1008"/>
-        </w:numPr>
-      </w:pPr>
-      <w:r>
-        <w:rPr>
-          <w:b/>
-          <w:bCs/>
-        </w:rPr>
-        <w:t xml:space="preserve">The immortal key.</w:t>
-      </w:r>
-      <w:r>
-        <w:t xml:space="preserve"> </w:t>
-      </w:r>
-      <w:r>
-        <w:t xml:space="preserve">A service has presented the same key pair for six years across three re-issuances because renewal reused the CSR. Key compromise anywhere in that window is compromise everywhere in it.</w:t>
-      </w:r>
-    </w:p>
-    <w:p>
-      <w:pPr>
-        <w:pStyle w:val="FirstParagraph"/>
-      </w:pPr>
-      <w:r>
-        <w:t xml:space="preserve">These are not staffing failures. They are the arithmetic of manual custody at machine scale: an estate of thousands of certificates with lifetimes measured in weeks cannot be operated by calendar reminders even in principle.</w:t>
-      </w:r>
-    </w:p>
-    <w:bookmarkEnd w:id="46"/>
-    <w:bookmarkStart w:id="47" w:name="Xf3837ac675b363d64c320238b77aed82d3d3087"/>
-    <w:p>
-      <w:pPr>
-        <w:pStyle w:val="Heading2"/>
-      </w:pPr>
-      <w:r>
-        <w:t xml:space="preserve">4.2 The Arithmetic Just Got Worse — Deliberately</w:t>
-      </w:r>
-    </w:p>
-    <w:p>
-      <w:pPr>
-        <w:pStyle w:val="FirstParagraph"/>
-      </w:pPr>
-      <w:r>
-        <w:t xml:space="preserve">The CA/Browser Forum has adopted a schedule that reduces the maximum validity of publicly trusted TLS certificates from 398 days stepwise down to</w:t>
-      </w:r>
-      <w:r>
-        <w:t xml:space="preserve"> </w:t>
-      </w:r>
-      <w:r>
-        <w:rPr>
-          <w:b/>
-          <w:bCs/>
-        </w:rPr>
-        <w:t xml:space="preserve">47 days by 2029</w:t>
-      </w:r>
-      <w:r>
-        <w:t xml:space="preserve">, with the first reductions already in force in 2026. The browser ecosystem is doing this</w:t>
-      </w:r>
-      <w:r>
-        <w:t xml:space="preserve"> </w:t>
-      </w:r>
-      <w:r>
-        <w:rPr>
-          <w:i/>
-          <w:iCs/>
-        </w:rPr>
-        <w:t xml:space="preserve">on purpose</w:t>
-      </w:r>
-      <w:r>
-        <w:t xml:space="preserve">: short-lived certificates shrink the window in which a mis-issued or compromised certificate is useful, and they reduce the load-bearing role of revocation (a 30-day certificate is</w:t>
-      </w:r>
-      <w:r>
-        <w:t xml:space="preserve"> </w:t>
-      </w:r>
-      <w:r>
-        <w:t xml:space="preserve">“revoked”</w:t>
-      </w:r>
-      <w:r>
-        <w:t xml:space="preserve"> </w:t>
-      </w:r>
-      <w:r>
-        <w:t xml:space="preserve">by simply not renewing it). The policy consequence for agencies is blunt:</w:t>
-      </w:r>
-    </w:p>
-    <w:p>
-      <w:pPr>
-        <w:pStyle w:val="BlockText"/>
-      </w:pPr>
-      <w:r>
-        <w:rPr>
-          <w:b/>
-          <w:bCs/>
-        </w:rPr>
-        <w:t xml:space="preserve">At 47-day lifetimes, manual certificate management is not risky — it is impossible.</w:t>
-      </w:r>
-      <w:r>
-        <w:t xml:space="preserve"> </w:t>
-      </w:r>
-      <w:r>
-        <w:t xml:space="preserve">An estate of 2,000 certificates renewing every 47 days generates a renewal event roughly every 34 minutes, around the clock. No ticket queue processes that. Automation is not a maturity milestone; it is the only arithmetic that closes.</w:t>
-      </w:r>
-    </w:p>
-    <w:bookmarkEnd w:id="47"/>
-    <w:bookmarkStart w:id="52" w:name="the-automation-stack"/>
-    <w:p>
-      <w:pPr>
-        <w:pStyle w:val="Heading2"/>
-      </w:pPr>
-      <w:r>
-        <w:t xml:space="preserve">4.3 The Automation Stack</w:t>
+        <w:pStyle w:val="BodyText"/>
+      </w:pPr>
+      <w:r>
+        <w:t xml:space="preserve"> </w:t>
       </w:r>
     </w:p>
     <w:tbl>
@@ -3514,7 +3339,7 @@
       <w:tr>
         <w:tc>
           <w:tcPr/>
-          <w:bookmarkStart w:id="51" w:name="fig-ct03"/>
+          <w:bookmarkStart w:id="47" w:name="fig-ct06"/>
           <w:p>
             <w:pPr>
               <w:pStyle w:val="Compact"/>
@@ -3525,18 +3350,18 @@
                 <wp:inline>
                   <wp:extent cx="5334000" cy="3000375"/>
                   <wp:effectExtent b="0" l="0" r="0" t="0"/>
-                  <wp:docPr descr="" title="" id="49" name="Picture"/>
+                  <wp:docPr descr="" title="" id="45" name="Picture"/>
                   <a:graphic>
                     <a:graphicData uri="http://schemas.openxmlformats.org/drawingml/2006/picture">
                       <pic:pic>
                         <pic:nvPicPr>
-                          <pic:cNvPr descr="figs/ct-fig-03-acme-lifecycle.png" id="50" name="Picture"/>
+                          <pic:cNvPr descr="figs/ct-fig-06-trust-hierarchy.png" id="46" name="Picture"/>
                           <pic:cNvPicPr>
                             <a:picLocks noChangeArrowheads="1" noChangeAspect="1"/>
                           </pic:cNvPicPr>
                         </pic:nvPicPr>
                         <pic:blipFill>
-                          <a:blip r:embed="rId48"/>
+                          <a:blip r:embed="rId44"/>
                           <a:stretch>
                             <a:fillRect/>
                           </a:stretch>
@@ -3573,10 +3398,293 @@
               <w:pStyle w:val="ImageCaption"/>
             </w:pPr>
             <w:r>
-              <w:t xml:space="preserve">Figure 3: The automated certificate lifecycle: enrollment protocols, short lifetimes, and DDI-keyed inventory</w:t>
-            </w:r>
-          </w:p>
-          <w:bookmarkEnd w:id="51"/>
+              <w:t xml:space="preserve">Figure 3: The internal trust hierarchy — offline root, purpose-scoped issuing CAs, automated end entities</w:t>
+            </w:r>
+          </w:p>
+          <w:bookmarkEnd w:id="47"/>
+        </w:tc>
+      </w:tr>
+    </w:tbl>
+    <w:p>
+      <w:pPr>
+        <w:pStyle w:val="BlockText"/>
+      </w:pPr>
+      <w:r>
+        <w:rPr>
+          <w:b/>
+          <w:bCs/>
+        </w:rPr>
+        <w:t xml:space="preserve">Closure Necessity — SC-17 certificate issuance under policy.</w:t>
+      </w:r>
+      <w:r>
+        <w:t xml:space="preserve"> </w:t>
+      </w:r>
+      <w:r>
+        <w:t xml:space="preserve">SC-17 requires certificates to be issued under an organization-defined certificate policy and requires trust stores to contain only approved trust anchors. A written certificate policy constrains no one at the moment of issuance; the only machine-enforced expression of issuance policy is the CAA record in the authoritative zone, checked by protocol at every public issuance, paired with an internal CA whose enrollment gates (SCEP/EST/ACME) execute against the same authoritative naming plane. There is no scanner, memo, or procurement clause that prevents an unauthorized issuance after the fact — only the naming plane can refuse it before the fact.</w:t>
+      </w:r>
+    </w:p>
+    <w:bookmarkEnd w:id="48"/>
+    <w:bookmarkEnd w:id="49"/>
+    <w:bookmarkStart w:id="62" w:name="X5640bec4ca7d998923d0137acff7faca70a4b04"/>
+    <w:p>
+      <w:pPr>
+        <w:pStyle w:val="Heading1"/>
+      </w:pPr>
+      <w:r>
+        <w:t xml:space="preserve">4. Certificate Lifecycle Automation — The End of the Spreadsheet CA</w:t>
+      </w:r>
+    </w:p>
+    <w:bookmarkStart w:id="50" w:name="the-failure-mode-being-retired"/>
+    <w:p>
+      <w:pPr>
+        <w:pStyle w:val="Heading2"/>
+      </w:pPr>
+      <w:r>
+        <w:t xml:space="preserve">4.1 The Failure Mode Being Retired</w:t>
+      </w:r>
+    </w:p>
+    <w:p>
+      <w:pPr>
+        <w:pStyle w:val="FirstParagraph"/>
+      </w:pPr>
+      <w:r>
+        <w:t xml:space="preserve">The legacy operating model for federal certificate management is a spreadsheet: a list of certificates, expiry dates, owning contacts, and renewal reminders maintained by hand. Its failure modes are so uniform they are practically a curriculum:</w:t>
+      </w:r>
+    </w:p>
+    <w:p>
+      <w:pPr>
+        <w:pStyle w:val="Compact"/>
+        <w:numPr>
+          <w:ilvl w:val="0"/>
+          <w:numId w:val="1008"/>
+        </w:numPr>
+      </w:pPr>
+      <w:r>
+        <w:rPr>
+          <w:b/>
+          <w:bCs/>
+        </w:rPr>
+        <w:t xml:space="preserve">The expiry outage.</w:t>
+      </w:r>
+      <w:r>
+        <w:t xml:space="preserve"> </w:t>
+      </w:r>
+      <w:r>
+        <w:t xml:space="preserve">A certificate expires because the reminder went to a departed employee’s mailbox. The application fails closed at 2 a.m. The post-incident action item is a better spreadsheet.</w:t>
+      </w:r>
+    </w:p>
+    <w:p>
+      <w:pPr>
+        <w:pStyle w:val="Compact"/>
+        <w:numPr>
+          <w:ilvl w:val="0"/>
+          <w:numId w:val="1008"/>
+        </w:numPr>
+      </w:pPr>
+      <w:r>
+        <w:rPr>
+          <w:b/>
+          <w:bCs/>
+        </w:rPr>
+        <w:t xml:space="preserve">The unknown certificate.</w:t>
+      </w:r>
+      <w:r>
+        <w:t xml:space="preserve"> </w:t>
+      </w:r>
+      <w:r>
+        <w:t xml:space="preserve">A scan finds a certificate on a production listener that appears in no inventory. Nobody knows which CA issued it, who holds the private key, or what breaks if it is revoked. It is left alone, which is the worst available answer.</w:t>
+      </w:r>
+    </w:p>
+    <w:p>
+      <w:pPr>
+        <w:pStyle w:val="Compact"/>
+        <w:numPr>
+          <w:ilvl w:val="0"/>
+          <w:numId w:val="1008"/>
+        </w:numPr>
+      </w:pPr>
+      <w:r>
+        <w:rPr>
+          <w:b/>
+          <w:bCs/>
+        </w:rPr>
+        <w:t xml:space="preserve">The immortal key.</w:t>
+      </w:r>
+      <w:r>
+        <w:t xml:space="preserve"> </w:t>
+      </w:r>
+      <w:r>
+        <w:t xml:space="preserve">A service has presented the same key pair for six years across three re-issuances because renewal reused the CSR. Key compromise anywhere in that window is compromise everywhere in it.</w:t>
+      </w:r>
+    </w:p>
+    <w:p>
+      <w:pPr>
+        <w:pStyle w:val="FirstParagraph"/>
+      </w:pPr>
+      <w:r>
+        <w:t xml:space="preserve">These are not staffing failures. They are the arithmetic of manual custody at machine scale: an estate of thousands of certificates with lifetimes measured in weeks cannot be operated by calendar reminders even in principle.</w:t>
+      </w:r>
+    </w:p>
+    <w:bookmarkEnd w:id="50"/>
+    <w:bookmarkStart w:id="51" w:name="Xf3837ac675b363d64c320238b77aed82d3d3087"/>
+    <w:p>
+      <w:pPr>
+        <w:pStyle w:val="Heading2"/>
+      </w:pPr>
+      <w:r>
+        <w:t xml:space="preserve">4.2 The Arithmetic Just Got Worse — Deliberately</w:t>
+      </w:r>
+    </w:p>
+    <w:p>
+      <w:pPr>
+        <w:pStyle w:val="FirstParagraph"/>
+      </w:pPr>
+      <w:r>
+        <w:t xml:space="preserve">The CA/Browser Forum has adopted a schedule that reduces the maximum validity of publicly trusted TLS certificates from 398 days stepwise down to</w:t>
+      </w:r>
+      <w:r>
+        <w:t xml:space="preserve"> </w:t>
+      </w:r>
+      <w:r>
+        <w:rPr>
+          <w:b/>
+          <w:bCs/>
+        </w:rPr>
+        <w:t xml:space="preserve">47 days by 2029</w:t>
+      </w:r>
+      <w:r>
+        <w:t xml:space="preserve">, with the first reductions already in force in 2026. The browser ecosystem is doing this</w:t>
+      </w:r>
+      <w:r>
+        <w:t xml:space="preserve"> </w:t>
+      </w:r>
+      <w:r>
+        <w:rPr>
+          <w:i/>
+          <w:iCs/>
+        </w:rPr>
+        <w:t xml:space="preserve">on purpose</w:t>
+      </w:r>
+      <w:r>
+        <w:t xml:space="preserve">: short-lived certificates shrink the window in which a mis-issued or compromised certificate is useful, and they reduce the load-bearing role of revocation (a 30-day certificate is</w:t>
+      </w:r>
+      <w:r>
+        <w:t xml:space="preserve"> </w:t>
+      </w:r>
+      <w:r>
+        <w:t xml:space="preserve">“revoked”</w:t>
+      </w:r>
+      <w:r>
+        <w:t xml:space="preserve"> </w:t>
+      </w:r>
+      <w:r>
+        <w:t xml:space="preserve">by simply not renewing it). The policy consequence for agencies is blunt:</w:t>
+      </w:r>
+    </w:p>
+    <w:p>
+      <w:pPr>
+        <w:pStyle w:val="BlockText"/>
+      </w:pPr>
+      <w:r>
+        <w:rPr>
+          <w:b/>
+          <w:bCs/>
+        </w:rPr>
+        <w:t xml:space="preserve">At 47-day lifetimes, manual certificate management is not risky — it is impossible.</w:t>
+      </w:r>
+      <w:r>
+        <w:t xml:space="preserve"> </w:t>
+      </w:r>
+      <w:r>
+        <w:t xml:space="preserve">An estate of 2,000 certificates renewing every 47 days generates a renewal event roughly every 34 minutes, around the clock. No ticket queue processes that. Automation is not a maturity milestone; it is the only arithmetic that closes.</w:t>
+      </w:r>
+    </w:p>
+    <w:bookmarkEnd w:id="51"/>
+    <w:bookmarkStart w:id="56" w:name="the-automation-stack"/>
+    <w:p>
+      <w:pPr>
+        <w:pStyle w:val="Heading2"/>
+      </w:pPr>
+      <w:r>
+        <w:t xml:space="preserve">4.3 The Automation Stack</w:t>
+      </w:r>
+    </w:p>
+    <w:tbl>
+      <w:tblPr>
+        <w:tblStyle w:val="Table"/>
+        <w:tblW w:type="pct" w:w="5000"/>
+        <w:tblLayout w:type="fixed"/>
+        <w:tblLook w:firstRow="0" w:lastRow="0" w:firstColumn="0" w:lastColumn="0" w:noHBand="0" w:noVBand="0" w:val="0000"/>
+      </w:tblPr>
+      <w:tblGrid>
+        <w:gridCol w:w="7920"/>
+      </w:tblGrid>
+      <w:tr>
+        <w:tc>
+          <w:tcPr/>
+          <w:bookmarkStart w:id="55" w:name="fig-ct03"/>
+          <w:p>
+            <w:pPr>
+              <w:pStyle w:val="Compact"/>
+              <w:jc w:val="center"/>
+            </w:pPr>
+            <w:r>
+              <w:drawing>
+                <wp:inline>
+                  <wp:extent cx="5334000" cy="3000375"/>
+                  <wp:effectExtent b="0" l="0" r="0" t="0"/>
+                  <wp:docPr descr="" title="" id="53" name="Picture"/>
+                  <a:graphic>
+                    <a:graphicData uri="http://schemas.openxmlformats.org/drawingml/2006/picture">
+                      <pic:pic>
+                        <pic:nvPicPr>
+                          <pic:cNvPr descr="figs/ct-fig-03-acme-lifecycle.png" id="54" name="Picture"/>
+                          <pic:cNvPicPr>
+                            <a:picLocks noChangeArrowheads="1" noChangeAspect="1"/>
+                          </pic:cNvPicPr>
+                        </pic:nvPicPr>
+                        <pic:blipFill>
+                          <a:blip r:embed="rId52"/>
+                          <a:stretch>
+                            <a:fillRect/>
+                          </a:stretch>
+                        </pic:blipFill>
+                        <pic:spPr bwMode="auto">
+                          <a:xfrm>
+                            <a:off x="0" y="0"/>
+                            <a:ext cx="5334000" cy="3000375"/>
+                          </a:xfrm>
+                          <a:prstGeom prst="rect">
+                            <a:avLst/>
+                          </a:prstGeom>
+                          <a:noFill/>
+                          <a:ln w="9525">
+                            <a:noFill/>
+                            <a:headEnd/>
+                            <a:tailEnd/>
+                          </a:ln>
+                        </pic:spPr>
+                      </pic:pic>
+                    </a:graphicData>
+                  </a:graphic>
+                </wp:inline>
+              </w:drawing>
+            </w:r>
+          </w:p>
+          <w:p>
+            <w:pPr>
+              <w:jc w:val="center"/>
+            </w:pPr>
+            <w:pPr>
+              <w:jc w:val="left"/>
+              <w:spacing w:before="200"/>
+              <w:pStyle w:val="ImageCaption"/>
+            </w:pPr>
+            <w:r>
+              <w:t xml:space="preserve">Figure 4: The automated certificate lifecycle: enrollment protocols, short lifetimes, and DDI-keyed inventory</w:t>
+            </w:r>
+          </w:p>
+          <w:bookmarkEnd w:id="55"/>
         </w:tc>
       </w:tr>
     </w:tbl>
@@ -3927,8 +4035,8 @@
         <w:t xml:space="preserve">condition: a listener presenting a certificate with no corresponding IPAM record is, by definition, drift.</w:t>
       </w:r>
     </w:p>
-    <w:bookmarkEnd w:id="52"/>
-    <w:bookmarkStart w:id="53" w:name="revocation-in-a-short-lived-world"/>
+    <w:bookmarkEnd w:id="56"/>
+    <w:bookmarkStart w:id="57" w:name="revocation-in-a-short-lived-world"/>
     <w:p>
       <w:pPr>
         <w:pStyle w:val="Heading2"/>
@@ -4074,8 +4182,8 @@
         <w:t xml:space="preserve">IA-5(2)(b)(2)’s required local cache of revocation data means a status-infrastructure outage degrades gracefully instead of silently disabling checking.</w:t>
       </w:r>
     </w:p>
-    <w:bookmarkEnd w:id="53"/>
-    <w:bookmarkStart w:id="57" w:name="certificate-telemetry-as-evidence"/>
+    <w:bookmarkEnd w:id="57"/>
+    <w:bookmarkStart w:id="61" w:name="certificate-telemetry-as-evidence"/>
     <w:p>
       <w:pPr>
         <w:pStyle w:val="Heading2"/>
@@ -4212,18 +4320,18 @@
                 <wp:inline>
                   <wp:extent cx="152400" cy="152400"/>
                   <wp:effectExtent b="0" l="0" r="0" t="0"/>
-                  <wp:docPr descr="" title="" id="55" name="Picture"/>
+                  <wp:docPr descr="" title="" id="59" name="Picture"/>
                   <a:graphic>
                     <a:graphicData uri="http://schemas.openxmlformats.org/drawingml/2006/picture">
                       <pic:pic>
                         <pic:nvPicPr>
-                          <pic:cNvPr descr="/opt/quarto/share/formats/docx/tip.png" id="56" name="Picture"/>
+                          <pic:cNvPr descr="C:\Program Files\Quarto\share\formats\docx\tip.png" id="60" name="Picture"/>
                           <pic:cNvPicPr>
                             <a:picLocks noChangeArrowheads="1" noChangeAspect="1"/>
                           </pic:cNvPicPr>
                         </pic:nvPicPr>
                         <pic:blipFill>
-                          <a:blip r:embed="rId54"/>
+                          <a:blip r:embed="rId58"/>
                           <a:stretch>
                             <a:fillRect/>
                           </a:stretch>
@@ -4325,9 +4433,9 @@
         </w:tc>
       </w:tr>
     </w:tbl>
-    <w:bookmarkEnd w:id="57"/>
-    <w:bookmarkEnd w:id="58"/>
-    <w:bookmarkStart w:id="67" w:name="Xc9df5656c1d4a669725636b29f1a4c4eceb5ea4"/>
+    <w:bookmarkEnd w:id="61"/>
+    <w:bookmarkEnd w:id="62"/>
+    <w:bookmarkStart w:id="75" w:name="Xc9df5656c1d4a669725636b29f1a4c4eceb5ea4"/>
     <w:p>
       <w:pPr>
         <w:pStyle w:val="Heading1"/>
@@ -4336,7 +4444,7 @@
         <w:t xml:space="preserve">5. Token-Based Identity — OAuth 2.0, OIDC, and Phishing-Resistant MFA</w:t>
       </w:r>
     </w:p>
-    <w:bookmarkStart w:id="59" w:name="the-token-inverts-the-trust-model"/>
+    <w:bookmarkStart w:id="63" w:name="the-token-inverts-the-trust-model"/>
     <w:p>
       <w:pPr>
         <w:pStyle w:val="Heading2"/>
@@ -4514,8 +4622,8 @@
         <w:t xml:space="preserve">Every issuance, refresh, and revocation is a structured event. This is the telemetry NTLM structurally cannot produce and that the evidence plane (Book 13, Book 19) requires.</w:t>
       </w:r>
     </w:p>
-    <w:bookmarkEnd w:id="59"/>
-    <w:bookmarkStart w:id="60" w:name="the-anatomy-of-the-token-layer"/>
+    <w:bookmarkEnd w:id="63"/>
+    <w:bookmarkStart w:id="68" w:name="the-anatomy-of-the-token-layer"/>
     <w:p>
       <w:pPr>
         <w:pStyle w:val="Heading2"/>
@@ -4822,358 +4930,7 @@
         <w:pStyle w:val="BodyText"/>
       </w:pPr>
       <w:r>
-        <w:t xml:space="preserve">Two engineering consequences follow. First,</w:t>
-      </w:r>
-      <w:r>
-        <w:t xml:space="preserve"> </w:t>
-      </w:r>
-      <w:r>
-        <w:rPr>
-          <w:b/>
-          <w:bCs/>
-        </w:rPr>
-        <w:t xml:space="preserve">the policy gate runs more than once</w:t>
-      </w:r>
-      <w:r>
-        <w:t xml:space="preserve">: refresh-token redemption re-evaluates conditional access, so a device that falls out of compliance or a user whose risk score spikes loses access at the next refresh — continuous access evaluation tightens this further by pushing revocation events to resources between refreshes. Second,</w:t>
-      </w:r>
-      <w:r>
-        <w:t xml:space="preserve"> </w:t>
-      </w:r>
-      <w:r>
-        <w:rPr>
-          <w:b/>
-          <w:bCs/>
-        </w:rPr>
-        <w:t xml:space="preserve">token signing keys are SC-12 objects</w:t>
-      </w:r>
-      <w:r>
-        <w:t xml:space="preserve">: the identity provider’s signing keys, published for verification and rotated on schedule, are cryptographic keys whose generation, rotation, and retirement follow the same lifecycle discipline as every certificate in this book. Relying services fetch current keys from the issuer’s published metadata; key rotation is invisible to applications</w:t>
-      </w:r>
-      <w:r>
-        <w:t xml:space="preserve"> </w:t>
-      </w:r>
-      <w:r>
-        <w:rPr>
-          <w:i/>
-          <w:iCs/>
-        </w:rPr>
-        <w:t xml:space="preserve">because</w:t>
-      </w:r>
-      <w:r>
-        <w:t xml:space="preserve"> </w:t>
-      </w:r>
-      <w:r>
-        <w:t xml:space="preserve">verification was built against the published set, not against a hardcoded key — the same</w:t>
-      </w:r>
-      <w:r>
-        <w:t xml:space="preserve"> </w:t>
-      </w:r>
-      <w:r>
-        <w:t xml:space="preserve">“automation, not custody”</w:t>
-      </w:r>
-      <w:r>
-        <w:t xml:space="preserve"> </w:t>
-      </w:r>
-      <w:r>
-        <w:t xml:space="preserve">doctrine, applied to the trust fabric itself.</w:t>
-      </w:r>
-    </w:p>
-    <w:bookmarkEnd w:id="60"/>
-    <w:bookmarkStart w:id="65" w:name="X684e9ee19c24f738fc994fe89cb5ac707432084"/>
-    <w:p>
-      <w:pPr>
-        <w:pStyle w:val="Heading2"/>
-      </w:pPr>
-      <w:r>
-        <w:t xml:space="preserve">5.3 Certificate-Based Authentication and Phishing-Resistant MFA</w:t>
-      </w:r>
-    </w:p>
-    <w:p>
-      <w:pPr>
-        <w:pStyle w:val="FirstParagraph"/>
-      </w:pPr>
-      <w:r>
-        <w:t xml:space="preserve">Tokens answer</w:t>
-      </w:r>
-      <w:r>
-        <w:t xml:space="preserve"> </w:t>
-      </w:r>
-      <w:r>
-        <w:rPr>
-          <w:i/>
-          <w:iCs/>
-        </w:rPr>
-        <w:t xml:space="preserve">how identity travels</w:t>
-      </w:r>
-      <w:r>
-        <w:t xml:space="preserve">. The credential ceremony underneath them — how the human proves presence to the identity provider — is where federal policy has drawn its sharpest line. OMB M-22-09 requires phishing-resistant MFA for agency staff, contractors, and partners; BOD 25-01’s secure configuration baselines for the federal cloud productivity estate enforce modern authentication and the retirement of legacy protocols that bypass it.</w:t>
-      </w:r>
-    </w:p>
-    <w:p>
-      <w:pPr>
-        <w:pStyle w:val="BodyText"/>
-      </w:pPr>
-      <w:r>
-        <w:t xml:space="preserve">“Phishing-resistant”</w:t>
-      </w:r>
-      <w:r>
-        <w:t xml:space="preserve"> </w:t>
-      </w:r>
-      <w:r>
-        <w:t xml:space="preserve">is a protocol property, not a marketing adjective. It means</w:t>
-      </w:r>
-      <w:r>
-        <w:t xml:space="preserve"> </w:t>
-      </w:r>
-      <w:r>
-        <w:rPr>
-          <w:b/>
-          <w:bCs/>
-        </w:rPr>
-        <w:t xml:space="preserve">verifier-impersonation resistance</w:t>
-      </w:r>
-      <w:r>
-        <w:t xml:space="preserve">: the credential cannot be replayed to the identity provider by a look-alike site, because the authentication is cryptographically bound to the origin or channel it terminates in. Exactly two credential families in general federal deployment have this property:</w:t>
-      </w:r>
-    </w:p>
-    <w:p>
-      <w:pPr>
-        <w:pStyle w:val="TableCaption"/>
-      </w:pPr>
-      <w:r>
-        <w:t xml:space="preserve">Credential families and verifier-impersonation resistance</w:t>
-      </w:r>
-    </w:p>
-    <w:tbl>
-      <w:tblPr>
-        <w:tblStyle w:val="Table"/>
-        <w:tblW w:type="pct" w:w="5000"/>
-        <w:tblLayout w:type="fixed"/>
-        <w:tblLook w:firstRow="1" w:lastRow="0" w:firstColumn="0" w:lastColumn="0" w:noHBand="0" w:noVBand="0" w:val="0020"/>
-        <w:tblCaption w:val="Credential families and verifier-impersonation resistance"/>
-      </w:tblPr>
-      <w:tblGrid>
-        <w:gridCol w:w="2640"/>
-        <w:gridCol w:w="2640"/>
-        <w:gridCol w:w="2640"/>
-      </w:tblGrid>
-      <w:tr>
-        <w:trPr>
-          <w:tblHeader w:val="on"/>
-        </w:trPr>
-        <w:tc>
-          <w:tcPr/>
-          <w:p>
-            <w:pPr>
-              <w:pStyle w:val="Compact"/>
-            </w:pPr>
-            <w:r>
-              <w:t xml:space="preserve">Credential</w:t>
-            </w:r>
-          </w:p>
-        </w:tc>
-        <w:tc>
-          <w:tcPr/>
-          <w:p>
-            <w:pPr>
-              <w:pStyle w:val="Compact"/>
-            </w:pPr>
-            <w:r>
-              <w:t xml:space="preserve">Mechanism</w:t>
-            </w:r>
-          </w:p>
-        </w:tc>
-        <w:tc>
-          <w:tcPr/>
-          <w:p>
-            <w:pPr>
-              <w:pStyle w:val="Compact"/>
-            </w:pPr>
-            <w:r>
-              <w:t xml:space="preserve">Why It Cannot Be Phished</w:t>
-            </w:r>
-          </w:p>
-        </w:tc>
-      </w:tr>
-      <w:tr>
-        <w:tc>
-          <w:tcPr/>
-          <w:p>
-            <w:pPr>
-              <w:pStyle w:val="Compact"/>
-            </w:pPr>
-            <w:r>
-              <w:rPr>
-                <w:b/>
-                <w:bCs/>
-              </w:rPr>
-              <w:t xml:space="preserve">PIV / smart card (certificate-based authentication)</w:t>
-            </w:r>
-          </w:p>
-        </w:tc>
-        <w:tc>
-          <w:tcPr/>
-          <w:p>
-            <w:pPr>
-              <w:pStyle w:val="Compact"/>
-            </w:pPr>
-            <w:r>
-              <w:t xml:space="preserve">Private key on hardware token; authentication is a signature over a challenge bound to the TLS channel</w:t>
-            </w:r>
-          </w:p>
-        </w:tc>
-        <w:tc>
-          <w:tcPr/>
-          <w:p>
-            <w:pPr>
-              <w:pStyle w:val="Compact"/>
-            </w:pPr>
-            <w:r>
-              <w:t xml:space="preserve">The key never leaves the card; a proxied challenge fails channel binding; there is no shared secret to capture</w:t>
-            </w:r>
-          </w:p>
-        </w:tc>
-      </w:tr>
-      <w:tr>
-        <w:tc>
-          <w:tcPr/>
-          <w:p>
-            <w:pPr>
-              <w:pStyle w:val="Compact"/>
-            </w:pPr>
-            <w:r>
-              <w:rPr>
-                <w:b/>
-                <w:bCs/>
-              </w:rPr>
-              <w:t xml:space="preserve">FIDO2 / WebAuthn platform or roaming authenticator</w:t>
-            </w:r>
-          </w:p>
-        </w:tc>
-        <w:tc>
-          <w:tcPr/>
-          <w:p>
-            <w:pPr>
-              <w:pStyle w:val="Compact"/>
-            </w:pPr>
-            <w:r>
-              <w:t xml:space="preserve">Origin-bound key pair per relying party; the browser signs the</w:t>
-            </w:r>
-            <w:r>
-              <w:t xml:space="preserve"> </w:t>
-            </w:r>
-            <w:r>
-              <w:rPr>
-                <w:i/>
-                <w:iCs/>
-              </w:rPr>
-              <w:t xml:space="preserve">actual</w:t>
-            </w:r>
-            <w:r>
-              <w:t xml:space="preserve"> </w:t>
-            </w:r>
-            <w:r>
-              <w:t xml:space="preserve">origin into the assertion</w:t>
-            </w:r>
-          </w:p>
-        </w:tc>
-        <w:tc>
-          <w:tcPr/>
-          <w:p>
-            <w:pPr>
-              <w:pStyle w:val="Compact"/>
-            </w:pPr>
-            <w:r>
-              <w:t xml:space="preserve">A credential registered to the legitimate origin produces an assertion a look-alike origin cannot use; the phishing site receives a signature for the wrong name</w:t>
-            </w:r>
-          </w:p>
-        </w:tc>
-      </w:tr>
-      <w:tr>
-        <w:tc>
-          <w:tcPr/>
-          <w:p>
-            <w:pPr>
-              <w:pStyle w:val="Compact"/>
-            </w:pPr>
-            <w:r>
-              <w:t xml:space="preserve">One-time passcodes, push approval, SMS</w:t>
-            </w:r>
-          </w:p>
-        </w:tc>
-        <w:tc>
-          <w:tcPr/>
-          <w:p>
-            <w:pPr>
-              <w:pStyle w:val="Compact"/>
-            </w:pPr>
-            <w:r>
-              <w:t xml:space="preserve">Shared secret or human approval relayed out of band</w:t>
-            </w:r>
-          </w:p>
-        </w:tc>
-        <w:tc>
-          <w:tcPr/>
-          <w:p>
-            <w:pPr>
-              <w:pStyle w:val="Compact"/>
-            </w:pPr>
-            <w:r>
-              <w:rPr>
-                <w:i/>
-                <w:iCs/>
-              </w:rPr>
-              <w:t xml:space="preserve">Not phishing-resistant</w:t>
-            </w:r>
-            <w:r>
-              <w:t xml:space="preserve"> </w:t>
-            </w:r>
-            <w:r>
-              <w:t xml:space="preserve">— the human can be induced to relay the secret or approve the attacker’s session; excluded by M-22-09 for this reason</w:t>
-            </w:r>
-          </w:p>
-        </w:tc>
-      </w:tr>
-    </w:tbl>
-    <w:p>
-      <w:pPr>
-        <w:pStyle w:val="BodyText"/>
-      </w:pPr>
-      <w:r>
-        <w:t xml:space="preserve">Note what both phishing-resistant rows have in common:</w:t>
-      </w:r>
-      <w:r>
-        <w:t xml:space="preserve"> </w:t>
-      </w:r>
-      <w:r>
-        <w:rPr>
-          <w:b/>
-          <w:bCs/>
-        </w:rPr>
-        <w:t xml:space="preserve">they are certificates and key pairs.</w:t>
-      </w:r>
-      <w:r>
-        <w:t xml:space="preserve"> </w:t>
-      </w:r>
-      <w:r>
-        <w:t xml:space="preserve">Certificate-based authentication</w:t>
-      </w:r>
-      <w:r>
-        <w:t xml:space="preserve"> </w:t>
-      </w:r>
-      <w:r>
-        <w:rPr>
-          <w:i/>
-          <w:iCs/>
-        </w:rPr>
-        <w:t xml:space="preserve">is</w:t>
-      </w:r>
-      <w:r>
-        <w:t xml:space="preserve"> </w:t>
-      </w:r>
-      <w:r>
-        <w:t xml:space="preserve">PKI applied to the user; WebAuthn is PKI with per-origin key issuance. The naming-plane doctrine of this book does not stop at TLS listeners — the human credential layer is the same cryptography, bound to names (origins, principals) the same way.</w:t>
+        <w:t xml:space="preserve"> </w:t>
       </w:r>
     </w:p>
     <w:tbl>
@@ -5189,7 +4946,7 @@
       <w:tr>
         <w:tc>
           <w:tcPr/>
-          <w:bookmarkStart w:id="64" w:name="fig-ct04"/>
+          <w:bookmarkStart w:id="67" w:name="fig-ct07"/>
           <w:p>
             <w:pPr>
               <w:pStyle w:val="Compact"/>
@@ -5200,18 +4957,18 @@
                 <wp:inline>
                   <wp:extent cx="5334000" cy="3000375"/>
                   <wp:effectExtent b="0" l="0" r="0" t="0"/>
-                  <wp:docPr descr="" title="" id="62" name="Picture"/>
+                  <wp:docPr descr="" title="" id="65" name="Picture"/>
                   <a:graphic>
                     <a:graphicData uri="http://schemas.openxmlformats.org/drawingml/2006/picture">
                       <pic:pic>
                         <pic:nvPicPr>
-                          <pic:cNvPr descr="figs/ct-fig-04-token-issuance-gate.png" id="63" name="Picture"/>
+                          <pic:cNvPr descr="figs/ct-fig-07-token-anatomy.png" id="66" name="Picture"/>
                           <pic:cNvPicPr>
                             <a:picLocks noChangeArrowheads="1" noChangeAspect="1"/>
                           </pic:cNvPicPr>
                         </pic:nvPicPr>
                         <pic:blipFill>
-                          <a:blip r:embed="rId61"/>
+                          <a:blip r:embed="rId64"/>
                           <a:stretch>
                             <a:fillRect/>
                           </a:stretch>
@@ -5248,15 +5005,453 @@
               <w:pStyle w:val="ImageCaption"/>
             </w:pPr>
             <w:r>
-              <w:t xml:space="preserve">Figure 4: Token issuance as the policy gate: phishing-resistant credential in, signed path-independent assertion out</w:t>
-            </w:r>
-          </w:p>
-          <w:bookmarkEnd w:id="64"/>
+              <w:t xml:space="preserve">Figure 5: The refresh token is the high-value target — and every redemption re-enters the policy gate</w:t>
+            </w:r>
+          </w:p>
+          <w:bookmarkEnd w:id="67"/>
         </w:tc>
       </w:tr>
     </w:tbl>
-    <w:bookmarkEnd w:id="65"/>
-    <w:bookmarkStart w:id="66" w:name="Xc3e4f9fdf11dcde1ed46022047cade5018f29af"/>
+    <w:p>
+      <w:pPr>
+        <w:pStyle w:val="BodyText"/>
+      </w:pPr>
+      <w:r>
+        <w:t xml:space="preserve">Two engineering consequences follow. First,</w:t>
+      </w:r>
+      <w:r>
+        <w:t xml:space="preserve"> </w:t>
+      </w:r>
+      <w:r>
+        <w:rPr>
+          <w:b/>
+          <w:bCs/>
+        </w:rPr>
+        <w:t xml:space="preserve">the policy gate runs more than once</w:t>
+      </w:r>
+      <w:r>
+        <w:t xml:space="preserve">: refresh-token redemption re-evaluates conditional access, so a device that falls out of compliance or a user whose risk score spikes loses access at the next refresh — continuous access evaluation tightens this further by pushing revocation events to resources between refreshes. Second,</w:t>
+      </w:r>
+      <w:r>
+        <w:t xml:space="preserve"> </w:t>
+      </w:r>
+      <w:r>
+        <w:rPr>
+          <w:b/>
+          <w:bCs/>
+        </w:rPr>
+        <w:t xml:space="preserve">token signing keys are SC-12 objects</w:t>
+      </w:r>
+      <w:r>
+        <w:t xml:space="preserve">: the identity provider’s signing keys, published for verification and rotated on schedule, are cryptographic keys whose generation, rotation, and retirement follow the same lifecycle discipline as every certificate in this book. Relying services fetch current keys from the issuer’s published metadata; key rotation is invisible to applications</w:t>
+      </w:r>
+      <w:r>
+        <w:t xml:space="preserve"> </w:t>
+      </w:r>
+      <w:r>
+        <w:rPr>
+          <w:i/>
+          <w:iCs/>
+        </w:rPr>
+        <w:t xml:space="preserve">because</w:t>
+      </w:r>
+      <w:r>
+        <w:t xml:space="preserve"> </w:t>
+      </w:r>
+      <w:r>
+        <w:t xml:space="preserve">verification was built against the published set, not against a hardcoded key — the same</w:t>
+      </w:r>
+      <w:r>
+        <w:t xml:space="preserve"> </w:t>
+      </w:r>
+      <w:r>
+        <w:t xml:space="preserve">“automation, not custody”</w:t>
+      </w:r>
+      <w:r>
+        <w:t xml:space="preserve"> </w:t>
+      </w:r>
+      <w:r>
+        <w:t xml:space="preserve">doctrine, applied to the trust fabric itself.</w:t>
+      </w:r>
+    </w:p>
+    <w:bookmarkEnd w:id="68"/>
+    <w:bookmarkStart w:id="73" w:name="X684e9ee19c24f738fc994fe89cb5ac707432084"/>
+    <w:p>
+      <w:pPr>
+        <w:pStyle w:val="Heading2"/>
+      </w:pPr>
+      <w:r>
+        <w:t xml:space="preserve">5.3 Certificate-Based Authentication and Phishing-Resistant MFA</w:t>
+      </w:r>
+    </w:p>
+    <w:p>
+      <w:pPr>
+        <w:pStyle w:val="FirstParagraph"/>
+      </w:pPr>
+      <w:r>
+        <w:t xml:space="preserve">Tokens answer</w:t>
+      </w:r>
+      <w:r>
+        <w:t xml:space="preserve"> </w:t>
+      </w:r>
+      <w:r>
+        <w:rPr>
+          <w:i/>
+          <w:iCs/>
+        </w:rPr>
+        <w:t xml:space="preserve">how identity travels</w:t>
+      </w:r>
+      <w:r>
+        <w:t xml:space="preserve">. The credential ceremony underneath them — how the human proves presence to the identity provider — is where federal policy has drawn its sharpest line. OMB M-22-09 requires phishing-resistant MFA for agency staff, contractors, and partners; BOD 25-01’s secure configuration baselines for the federal cloud productivity estate enforce modern authentication and the retirement of legacy protocols that bypass it.</w:t>
+      </w:r>
+    </w:p>
+    <w:p>
+      <w:pPr>
+        <w:pStyle w:val="BodyText"/>
+      </w:pPr>
+      <w:r>
+        <w:t xml:space="preserve">“Phishing-resistant”</w:t>
+      </w:r>
+      <w:r>
+        <w:t xml:space="preserve"> </w:t>
+      </w:r>
+      <w:r>
+        <w:t xml:space="preserve">is a protocol property, not a marketing adjective. It means</w:t>
+      </w:r>
+      <w:r>
+        <w:t xml:space="preserve"> </w:t>
+      </w:r>
+      <w:r>
+        <w:rPr>
+          <w:b/>
+          <w:bCs/>
+        </w:rPr>
+        <w:t xml:space="preserve">verifier-impersonation resistance</w:t>
+      </w:r>
+      <w:r>
+        <w:t xml:space="preserve">: the credential cannot be replayed to the identity provider by a look-alike site, because the authentication is cryptographically bound to the origin or channel it terminates in. Exactly two credential families in general federal deployment have this property:</w:t>
+      </w:r>
+    </w:p>
+    <w:p>
+      <w:pPr>
+        <w:pStyle w:val="TableCaption"/>
+      </w:pPr>
+      <w:r>
+        <w:t xml:space="preserve">Credential families and verifier-impersonation resistance</w:t>
+      </w:r>
+    </w:p>
+    <w:tbl>
+      <w:tblPr>
+        <w:tblStyle w:val="Table"/>
+        <w:tblW w:type="pct" w:w="5000"/>
+        <w:tblLayout w:type="fixed"/>
+        <w:tblLook w:firstRow="1" w:lastRow="0" w:firstColumn="0" w:lastColumn="0" w:noHBand="0" w:noVBand="0" w:val="0020"/>
+        <w:tblCaption w:val="Credential families and verifier-impersonation resistance"/>
+      </w:tblPr>
+      <w:tblGrid>
+        <w:gridCol w:w="2640"/>
+        <w:gridCol w:w="2640"/>
+        <w:gridCol w:w="2640"/>
+      </w:tblGrid>
+      <w:tr>
+        <w:trPr>
+          <w:tblHeader w:val="on"/>
+        </w:trPr>
+        <w:tc>
+          <w:tcPr/>
+          <w:p>
+            <w:pPr>
+              <w:pStyle w:val="Compact"/>
+            </w:pPr>
+            <w:r>
+              <w:t xml:space="preserve">Credential</w:t>
+            </w:r>
+          </w:p>
+        </w:tc>
+        <w:tc>
+          <w:tcPr/>
+          <w:p>
+            <w:pPr>
+              <w:pStyle w:val="Compact"/>
+            </w:pPr>
+            <w:r>
+              <w:t xml:space="preserve">Mechanism</w:t>
+            </w:r>
+          </w:p>
+        </w:tc>
+        <w:tc>
+          <w:tcPr/>
+          <w:p>
+            <w:pPr>
+              <w:pStyle w:val="Compact"/>
+            </w:pPr>
+            <w:r>
+              <w:t xml:space="preserve">Why It Cannot Be Phished</w:t>
+            </w:r>
+          </w:p>
+        </w:tc>
+      </w:tr>
+      <w:tr>
+        <w:tc>
+          <w:tcPr/>
+          <w:p>
+            <w:pPr>
+              <w:pStyle w:val="Compact"/>
+            </w:pPr>
+            <w:r>
+              <w:rPr>
+                <w:b/>
+                <w:bCs/>
+              </w:rPr>
+              <w:t xml:space="preserve">PIV / smart card (certificate-based authentication)</w:t>
+            </w:r>
+          </w:p>
+        </w:tc>
+        <w:tc>
+          <w:tcPr/>
+          <w:p>
+            <w:pPr>
+              <w:pStyle w:val="Compact"/>
+            </w:pPr>
+            <w:r>
+              <w:t xml:space="preserve">Private key on hardware token; authentication is a signature over a challenge bound to the TLS channel</w:t>
+            </w:r>
+          </w:p>
+        </w:tc>
+        <w:tc>
+          <w:tcPr/>
+          <w:p>
+            <w:pPr>
+              <w:pStyle w:val="Compact"/>
+            </w:pPr>
+            <w:r>
+              <w:t xml:space="preserve">The key never leaves the card; a proxied challenge fails channel binding; there is no shared secret to capture</w:t>
+            </w:r>
+          </w:p>
+        </w:tc>
+      </w:tr>
+      <w:tr>
+        <w:tc>
+          <w:tcPr/>
+          <w:p>
+            <w:pPr>
+              <w:pStyle w:val="Compact"/>
+            </w:pPr>
+            <w:r>
+              <w:rPr>
+                <w:b/>
+                <w:bCs/>
+              </w:rPr>
+              <w:t xml:space="preserve">FIDO2 / WebAuthn platform or roaming authenticator</w:t>
+            </w:r>
+          </w:p>
+        </w:tc>
+        <w:tc>
+          <w:tcPr/>
+          <w:p>
+            <w:pPr>
+              <w:pStyle w:val="Compact"/>
+            </w:pPr>
+            <w:r>
+              <w:t xml:space="preserve">Origin-bound key pair per relying party; the browser signs the</w:t>
+            </w:r>
+            <w:r>
+              <w:t xml:space="preserve"> </w:t>
+            </w:r>
+            <w:r>
+              <w:rPr>
+                <w:i/>
+                <w:iCs/>
+              </w:rPr>
+              <w:t xml:space="preserve">actual</w:t>
+            </w:r>
+            <w:r>
+              <w:t xml:space="preserve"> </w:t>
+            </w:r>
+            <w:r>
+              <w:t xml:space="preserve">origin into the assertion</w:t>
+            </w:r>
+          </w:p>
+        </w:tc>
+        <w:tc>
+          <w:tcPr/>
+          <w:p>
+            <w:pPr>
+              <w:pStyle w:val="Compact"/>
+            </w:pPr>
+            <w:r>
+              <w:t xml:space="preserve">A credential registered to the legitimate origin produces an assertion a look-alike origin cannot use; the phishing site receives a signature for the wrong name</w:t>
+            </w:r>
+          </w:p>
+        </w:tc>
+      </w:tr>
+      <w:tr>
+        <w:tc>
+          <w:tcPr/>
+          <w:p>
+            <w:pPr>
+              <w:pStyle w:val="Compact"/>
+            </w:pPr>
+            <w:r>
+              <w:t xml:space="preserve">One-time passcodes, push approval, SMS</w:t>
+            </w:r>
+          </w:p>
+        </w:tc>
+        <w:tc>
+          <w:tcPr/>
+          <w:p>
+            <w:pPr>
+              <w:pStyle w:val="Compact"/>
+            </w:pPr>
+            <w:r>
+              <w:t xml:space="preserve">Shared secret or human approval relayed out of band</w:t>
+            </w:r>
+          </w:p>
+        </w:tc>
+        <w:tc>
+          <w:tcPr/>
+          <w:p>
+            <w:pPr>
+              <w:pStyle w:val="Compact"/>
+            </w:pPr>
+            <w:r>
+              <w:rPr>
+                <w:i/>
+                <w:iCs/>
+              </w:rPr>
+              <w:t xml:space="preserve">Not phishing-resistant</w:t>
+            </w:r>
+            <w:r>
+              <w:t xml:space="preserve"> </w:t>
+            </w:r>
+            <w:r>
+              <w:t xml:space="preserve">— the human can be induced to relay the secret or approve the attacker’s session; excluded by M-22-09 for this reason</w:t>
+            </w:r>
+          </w:p>
+        </w:tc>
+      </w:tr>
+    </w:tbl>
+    <w:p>
+      <w:pPr>
+        <w:pStyle w:val="BodyText"/>
+      </w:pPr>
+      <w:r>
+        <w:t xml:space="preserve">Note what both phishing-resistant rows have in common:</w:t>
+      </w:r>
+      <w:r>
+        <w:t xml:space="preserve"> </w:t>
+      </w:r>
+      <w:r>
+        <w:rPr>
+          <w:b/>
+          <w:bCs/>
+        </w:rPr>
+        <w:t xml:space="preserve">they are certificates and key pairs.</w:t>
+      </w:r>
+      <w:r>
+        <w:t xml:space="preserve"> </w:t>
+      </w:r>
+      <w:r>
+        <w:t xml:space="preserve">Certificate-based authentication</w:t>
+      </w:r>
+      <w:r>
+        <w:t xml:space="preserve"> </w:t>
+      </w:r>
+      <w:r>
+        <w:rPr>
+          <w:i/>
+          <w:iCs/>
+        </w:rPr>
+        <w:t xml:space="preserve">is</w:t>
+      </w:r>
+      <w:r>
+        <w:t xml:space="preserve"> </w:t>
+      </w:r>
+      <w:r>
+        <w:t xml:space="preserve">PKI applied to the user; WebAuthn is PKI with per-origin key issuance. The naming-plane doctrine of this book does not stop at TLS listeners — the human credential layer is the same cryptography, bound to names (origins, principals) the same way.</w:t>
+      </w:r>
+    </w:p>
+    <w:tbl>
+      <w:tblPr>
+        <w:tblStyle w:val="Table"/>
+        <w:tblW w:type="pct" w:w="5000"/>
+        <w:tblLayout w:type="fixed"/>
+        <w:tblLook w:firstRow="0" w:lastRow="0" w:firstColumn="0" w:lastColumn="0" w:noHBand="0" w:noVBand="0" w:val="0000"/>
+      </w:tblPr>
+      <w:tblGrid>
+        <w:gridCol w:w="7920"/>
+      </w:tblGrid>
+      <w:tr>
+        <w:tc>
+          <w:tcPr/>
+          <w:bookmarkStart w:id="72" w:name="fig-ct04"/>
+          <w:p>
+            <w:pPr>
+              <w:pStyle w:val="Compact"/>
+              <w:jc w:val="center"/>
+            </w:pPr>
+            <w:r>
+              <w:drawing>
+                <wp:inline>
+                  <wp:extent cx="5334000" cy="3000375"/>
+                  <wp:effectExtent b="0" l="0" r="0" t="0"/>
+                  <wp:docPr descr="" title="" id="70" name="Picture"/>
+                  <a:graphic>
+                    <a:graphicData uri="http://schemas.openxmlformats.org/drawingml/2006/picture">
+                      <pic:pic>
+                        <pic:nvPicPr>
+                          <pic:cNvPr descr="figs/ct-fig-04-token-issuance-gate.png" id="71" name="Picture"/>
+                          <pic:cNvPicPr>
+                            <a:picLocks noChangeArrowheads="1" noChangeAspect="1"/>
+                          </pic:cNvPicPr>
+                        </pic:nvPicPr>
+                        <pic:blipFill>
+                          <a:blip r:embed="rId69"/>
+                          <a:stretch>
+                            <a:fillRect/>
+                          </a:stretch>
+                        </pic:blipFill>
+                        <pic:spPr bwMode="auto">
+                          <a:xfrm>
+                            <a:off x="0" y="0"/>
+                            <a:ext cx="5334000" cy="3000375"/>
+                          </a:xfrm>
+                          <a:prstGeom prst="rect">
+                            <a:avLst/>
+                          </a:prstGeom>
+                          <a:noFill/>
+                          <a:ln w="9525">
+                            <a:noFill/>
+                            <a:headEnd/>
+                            <a:tailEnd/>
+                          </a:ln>
+                        </pic:spPr>
+                      </pic:pic>
+                    </a:graphicData>
+                  </a:graphic>
+                </wp:inline>
+              </w:drawing>
+            </w:r>
+          </w:p>
+          <w:p>
+            <w:pPr>
+              <w:jc w:val="center"/>
+            </w:pPr>
+            <w:pPr>
+              <w:jc w:val="left"/>
+              <w:spacing w:before="200"/>
+              <w:pStyle w:val="ImageCaption"/>
+            </w:pPr>
+            <w:r>
+              <w:t xml:space="preserve">Figure 6: Token issuance as the policy gate: phishing-resistant credential in, signed path-independent assertion out</w:t>
+            </w:r>
+          </w:p>
+          <w:bookmarkEnd w:id="72"/>
+        </w:tc>
+      </w:tr>
+    </w:tbl>
+    <w:bookmarkEnd w:id="73"/>
+    <w:bookmarkStart w:id="74" w:name="Xc3e4f9fdf11dcde1ed46022047cade5018f29af"/>
     <w:p>
       <w:pPr>
         <w:pStyle w:val="Heading2"/>
@@ -5416,9 +5611,9 @@
         <w:t xml:space="preserve">. Book 05’s Principle 1 — restore a single source of truth — is a precondition, not a preference: an identity provider signing group memberships inherited from twelve drifted regional directory trees produces well-formed tokens asserting broken facts. Cryptography transports truth; it does not manufacture it.</w:t>
       </w:r>
     </w:p>
-    <w:bookmarkEnd w:id="66"/>
-    <w:bookmarkEnd w:id="67"/>
-    <w:bookmarkStart w:id="70" w:name="federal-policy-alignment"/>
+    <w:bookmarkEnd w:id="74"/>
+    <w:bookmarkEnd w:id="75"/>
+    <w:bookmarkStart w:id="78" w:name="federal-policy-alignment"/>
     <w:p>
       <w:pPr>
         <w:pStyle w:val="Heading1"/>
@@ -5814,12 +6009,12 @@
                 <wp:inline>
                   <wp:extent cx="152400" cy="152400"/>
                   <wp:effectExtent b="0" l="0" r="0" t="0"/>
-                  <wp:docPr descr="" title="" id="68" name="Picture"/>
+                  <wp:docPr descr="" title="" id="76" name="Picture"/>
                   <a:graphic>
                     <a:graphicData uri="http://schemas.openxmlformats.org/drawingml/2006/picture">
                       <pic:pic>
                         <pic:nvPicPr>
-                          <pic:cNvPr descr="/opt/quarto/share/formats/docx/note.png" id="69" name="Picture"/>
+                          <pic:cNvPr descr="C:\Program Files\Quarto\share\formats\docx\note.png" id="77" name="Picture"/>
                           <pic:cNvPicPr>
                             <a:picLocks noChangeArrowheads="1" noChangeAspect="1"/>
                           </pic:cNvPicPr>
@@ -5915,8 +6110,8 @@
         </w:tc>
       </w:tr>
     </w:tbl>
-    <w:bookmarkEnd w:id="70"/>
-    <w:bookmarkStart w:id="78" w:name="machine-and-workload-identity"/>
+    <w:bookmarkEnd w:id="78"/>
+    <w:bookmarkStart w:id="86" w:name="machine-and-workload-identity"/>
     <w:p>
       <w:pPr>
         <w:pStyle w:val="Heading1"/>
@@ -5925,7 +6120,7 @@
         <w:t xml:space="preserve">7. Machine and Workload Identity</w:t>
       </w:r>
     </w:p>
-    <w:bookmarkStart w:id="75" w:name="the-non-human-majority"/>
+    <w:bookmarkStart w:id="83" w:name="the-non-human-majority"/>
     <w:p>
       <w:pPr>
         <w:pStyle w:val="Heading2"/>
@@ -6235,7 +6430,7 @@
       <w:tr>
         <w:tc>
           <w:tcPr/>
-          <w:bookmarkStart w:id="74" w:name="fig-ct05"/>
+          <w:bookmarkStart w:id="82" w:name="fig-ct05"/>
           <w:p>
             <w:pPr>
               <w:pStyle w:val="Compact"/>
@@ -6246,18 +6441,18 @@
                 <wp:inline>
                   <wp:extent cx="5334000" cy="3000375"/>
                   <wp:effectExtent b="0" l="0" r="0" t="0"/>
-                  <wp:docPr descr="" title="" id="72" name="Picture"/>
+                  <wp:docPr descr="" title="" id="80" name="Picture"/>
                   <a:graphic>
                     <a:graphicData uri="http://schemas.openxmlformats.org/drawingml/2006/picture">
                       <pic:pic>
                         <pic:nvPicPr>
-                          <pic:cNvPr descr="figs/ct-fig-05-workload-identity.png" id="73" name="Picture"/>
+                          <pic:cNvPr descr="figs/ct-fig-05-workload-identity.png" id="81" name="Picture"/>
                           <pic:cNvPicPr>
                             <a:picLocks noChangeArrowheads="1" noChangeAspect="1"/>
                           </pic:cNvPicPr>
                         </pic:nvPicPr>
                         <pic:blipFill>
-                          <a:blip r:embed="rId71"/>
+                          <a:blip r:embed="rId79"/>
                           <a:stretch>
                             <a:fillRect/>
                           </a:stretch>
@@ -6294,10 +6489,10 @@
               <w:pStyle w:val="ImageCaption"/>
             </w:pPr>
             <w:r>
-              <w:t xml:space="preserve">Figure 5: The workload identity progression from stored passwords to federated attestation</w:t>
-            </w:r>
-          </w:p>
-          <w:bookmarkEnd w:id="74"/>
+              <w:t xml:space="preserve">Figure 7: The workload identity progression from stored passwords to federated attestation</w:t>
+            </w:r>
+          </w:p>
+          <w:bookmarkEnd w:id="82"/>
         </w:tc>
       </w:tr>
     </w:tbl>
@@ -6338,8 +6533,8 @@
         <w:t xml:space="preserve">, at runtime, and expires in minutes. There is no secret to leak because there is no secret.</w:t>
       </w:r>
     </w:p>
-    <w:bookmarkEnd w:id="75"/>
-    <w:bookmarkStart w:id="76" w:name="where-keys-live"/>
+    <w:bookmarkEnd w:id="83"/>
+    <w:bookmarkStart w:id="84" w:name="where-keys-live"/>
     <w:p>
       <w:pPr>
         <w:pStyle w:val="Heading2"/>
@@ -6648,8 +6843,8 @@
         <w:t xml:space="preserve">implemented as protocol rather than as procedure.</w:t>
       </w:r>
     </w:p>
-    <w:bookmarkEnd w:id="76"/>
-    <w:bookmarkStart w:id="77" w:name="what-this-sets-up"/>
+    <w:bookmarkEnd w:id="84"/>
+    <w:bookmarkStart w:id="85" w:name="what-this-sets-up"/>
     <w:p>
       <w:pPr>
         <w:pStyle w:val="Heading2"/>
@@ -6895,9 +7090,9 @@
         <w:t xml:space="preserve">Later parts repeat the same move against other estates — privileged sessions (Book 10), data-plane access (Book 12), detection surfaces (Book 13) — and none of them introduces new identity doctrine, because after this part there is none left to introduce.</w:t>
       </w:r>
     </w:p>
-    <w:bookmarkEnd w:id="77"/>
-    <w:bookmarkEnd w:id="78"/>
-    <w:bookmarkStart w:id="83" w:name="phased-implementation"/>
+    <w:bookmarkEnd w:id="85"/>
+    <w:bookmarkEnd w:id="86"/>
+    <w:bookmarkStart w:id="95" w:name="phased-implementation"/>
     <w:p>
       <w:pPr>
         <w:pStyle w:val="Heading1"/>
@@ -6930,7 +7125,86 @@
         <w:t xml:space="preserve">Each phase creates the inventory and telemetry that make the next phase’s enforcement decisions safe. Durations are indicative for a mid-size federal estate; the ordering is not optional, because each phase’s gate is the previous phase’s output.</w:t>
       </w:r>
     </w:p>
-    <w:bookmarkStart w:id="79" w:name="X6a680b051ec28a9d607bf2f968af94dcddf0d42"/>
+    <w:tbl>
+      <w:tblPr>
+        <w:tblStyle w:val="Table"/>
+        <w:tblW w:type="pct" w:w="5000"/>
+        <w:tblLayout w:type="fixed"/>
+        <w:tblLook w:firstRow="0" w:lastRow="0" w:firstColumn="0" w:lastColumn="0" w:noHBand="0" w:noVBand="0" w:val="0000"/>
+      </w:tblPr>
+      <w:tblGrid>
+        <w:gridCol w:w="7920"/>
+      </w:tblGrid>
+      <w:tr>
+        <w:tc>
+          <w:tcPr/>
+          <w:bookmarkStart w:id="90" w:name="fig-ct08"/>
+          <w:p>
+            <w:pPr>
+              <w:pStyle w:val="Compact"/>
+              <w:jc w:val="center"/>
+            </w:pPr>
+            <w:r>
+              <w:drawing>
+                <wp:inline>
+                  <wp:extent cx="5334000" cy="3000375"/>
+                  <wp:effectExtent b="0" l="0" r="0" t="0"/>
+                  <wp:docPr descr="" title="" id="88" name="Picture"/>
+                  <a:graphic>
+                    <a:graphicData uri="http://schemas.openxmlformats.org/drawingml/2006/picture">
+                      <pic:pic>
+                        <pic:nvPicPr>
+                          <pic:cNvPr descr="figs/ct-fig-08-phased-implementation.png" id="89" name="Picture"/>
+                          <pic:cNvPicPr>
+                            <a:picLocks noChangeArrowheads="1" noChangeAspect="1"/>
+                          </pic:cNvPicPr>
+                        </pic:nvPicPr>
+                        <pic:blipFill>
+                          <a:blip r:embed="rId87"/>
+                          <a:stretch>
+                            <a:fillRect/>
+                          </a:stretch>
+                        </pic:blipFill>
+                        <pic:spPr bwMode="auto">
+                          <a:xfrm>
+                            <a:off x="0" y="0"/>
+                            <a:ext cx="5334000" cy="3000375"/>
+                          </a:xfrm>
+                          <a:prstGeom prst="rect">
+                            <a:avLst/>
+                          </a:prstGeom>
+                          <a:noFill/>
+                          <a:ln w="9525">
+                            <a:noFill/>
+                            <a:headEnd/>
+                            <a:tailEnd/>
+                          </a:ln>
+                        </pic:spPr>
+                      </pic:pic>
+                    </a:graphicData>
+                  </a:graphic>
+                </wp:inline>
+              </w:drawing>
+            </w:r>
+          </w:p>
+          <w:p>
+            <w:pPr>
+              <w:jc w:val="center"/>
+            </w:pPr>
+            <w:pPr>
+              <w:jc w:val="left"/>
+              <w:spacing w:before="200"/>
+              <w:pStyle w:val="ImageCaption"/>
+            </w:pPr>
+            <w:r>
+              <w:t xml:space="preserve">Figure 8: The four implementation phases and their gates — discovery, automation, token migration, workload conversion</w:t>
+            </w:r>
+          </w:p>
+          <w:bookmarkEnd w:id="90"/>
+        </w:tc>
+      </w:tr>
+    </w:tbl>
+    <w:bookmarkStart w:id="91" w:name="X6a680b051ec28a9d607bf2f968af94dcddf0d42"/>
     <w:p>
       <w:pPr>
         <w:pStyle w:val="Heading2"/>
@@ -6982,8 +7256,8 @@
         <w:t xml:space="preserve">every production certificate has an owner, an issuer, and an IPAM binding — or an investigation ticket.</w:t>
       </w:r>
     </w:p>
-    <w:bookmarkEnd w:id="79"/>
-    <w:bookmarkStart w:id="80" w:name="phase-2-issuance-automation-weeks-512"/>
+    <w:bookmarkEnd w:id="91"/>
+    <w:bookmarkStart w:id="92" w:name="phase-2-issuance-automation-weeks-512"/>
     <w:p>
       <w:pPr>
         <w:pStyle w:val="Heading2"/>
@@ -7018,8 +7292,8 @@
         <w:t xml:space="preserve">zero manual issuance requests for covered certificate classes in a 30-day window; renewal automation demonstrated through at least one full cycle.</w:t>
       </w:r>
     </w:p>
-    <w:bookmarkEnd w:id="80"/>
-    <w:bookmarkStart w:id="81" w:name="Xee5d6c6398530dcb5ae5c2feae99ac6099a57a4"/>
+    <w:bookmarkEnd w:id="92"/>
+    <w:bookmarkStart w:id="93" w:name="Xee5d6c6398530dcb5ae5c2feae99ac6099a57a4"/>
     <w:p>
       <w:pPr>
         <w:pStyle w:val="Heading2"/>
@@ -7054,8 +7328,8 @@
         <w:t xml:space="preserve">legacy authentication blocked with a measured zero business impact; privileged access impossible without a phishing-resistant assertion.</w:t>
       </w:r>
     </w:p>
-    <w:bookmarkEnd w:id="81"/>
-    <w:bookmarkStart w:id="82" w:name="X91d22899771017288efd1634ec3ba0ac5177ad3"/>
+    <w:bookmarkEnd w:id="93"/>
+    <w:bookmarkStart w:id="94" w:name="X91d22899771017288efd1634ec3ba0ac5177ad3"/>
     <w:p>
       <w:pPr>
         <w:pStyle w:val="Heading2"/>
@@ -7107,9 +7381,9 @@
         <w:t xml:space="preserve">the secret inventory trends monotonically to zero for covered workload classes, and every remaining entry has a named exception with an expiry date.</w:t>
       </w:r>
     </w:p>
-    <w:bookmarkEnd w:id="82"/>
-    <w:bookmarkEnd w:id="83"/>
-    <w:bookmarkStart w:id="88" w:name="nist-sp-800-53-rev-5-control-closure"/>
+    <w:bookmarkEnd w:id="94"/>
+    <w:bookmarkEnd w:id="95"/>
+    <w:bookmarkStart w:id="100" w:name="nist-sp-800-53-rev-5-control-closure"/>
     <w:p>
       <w:pPr>
         <w:pStyle w:val="Heading1"/>
@@ -7680,12 +7954,12 @@
                 <wp:inline>
                   <wp:extent cx="152400" cy="152400"/>
                   <wp:effectExtent b="0" l="0" r="0" t="0"/>
-                  <wp:docPr descr="" title="" id="84" name="Picture"/>
+                  <wp:docPr descr="" title="" id="96" name="Picture"/>
                   <a:graphic>
                     <a:graphicData uri="http://schemas.openxmlformats.org/drawingml/2006/picture">
                       <pic:pic>
                         <pic:nvPicPr>
-                          <pic:cNvPr descr="/opt/quarto/share/formats/docx/note.png" id="85" name="Picture"/>
+                          <pic:cNvPr descr="C:\Program Files\Quarto\share\formats\docx\note.png" id="97" name="Picture"/>
                           <pic:cNvPicPr>
                             <a:picLocks noChangeArrowheads="1" noChangeAspect="1"/>
                           </pic:cNvPicPr>
@@ -7824,7 +8098,7 @@
             <w:r>
               <w:t xml:space="preserve"> </w:t>
             </w:r>
-            <w:hyperlink r:id="rId86">
+            <w:hyperlink r:id="rId98">
               <w:r>
                 <w:rPr>
                   <w:rStyle w:val="Hyperlink"/>
@@ -7838,7 +8112,7 @@
             <w:r>
               <w:t xml:space="preserve"> </w:t>
             </w:r>
-            <w:hyperlink r:id="rId87">
+            <w:hyperlink r:id="rId99">
               <w:r>
                 <w:rPr>
                   <w:rStyle w:val="Hyperlink"/>
@@ -7857,8 +8131,8 @@
         </w:tc>
       </w:tr>
     </w:tbl>
-    <w:bookmarkEnd w:id="88"/>
-    <w:bookmarkStart w:id="91" w:name="series-context-part-3-of-19"/>
+    <w:bookmarkEnd w:id="100"/>
+    <w:bookmarkStart w:id="103" w:name="series-context-part-3-of-19"/>
     <w:p>
       <w:pPr>
         <w:pStyle w:val="Heading1"/>
@@ -7974,7 +8248,7 @@
       <w:r>
         <w:t xml:space="preserve"> </w:t>
       </w:r>
-      <w:hyperlink r:id="rId89">
+      <w:hyperlink r:id="rId101">
         <w:r>
           <w:rPr>
             <w:rStyle w:val="Hyperlink"/>
@@ -8032,7 +8306,7 @@
       <w:r>
         <w:t xml:space="preserve"> </w:t>
       </w:r>
-      <w:hyperlink r:id="rId87">
+      <w:hyperlink r:id="rId99">
         <w:r>
           <w:rPr>
             <w:rStyle w:val="Hyperlink"/>
@@ -8047,7 +8321,7 @@
         <w:t xml:space="preserve">assembles it into the authorization package.</w:t>
       </w:r>
     </w:p>
-    <w:bookmarkStart w:id="90" w:name="Xad7833ad9d3f8a98c7b789d14bc1caec63be7d1"/>
+    <w:bookmarkStart w:id="102" w:name="Xad7833ad9d3f8a98c7b789d14bc1caec63be7d1"/>
     <w:p>
       <w:pPr>
         <w:pStyle w:val="Heading2"/>
@@ -8337,8 +8611,8 @@
         <w:t xml:space="preserve">Federal Application-Aware Networking — Part 3 of 19. Parts 1–2 established the naming plane and device identity; Part 3 establishes cryptographic identity for users, devices, and workloads; Part 4 anchors those identities in the authoritative HR and organizational source of truth. Parts 5–19 apply this foundation to transport, applications, operations, and the authorization package.</w:t>
       </w:r>
     </w:p>
-    <w:bookmarkEnd w:id="90"/>
-    <w:bookmarkEnd w:id="91"/>
+    <w:bookmarkEnd w:id="102"/>
+    <w:bookmarkEnd w:id="103"/>
     <w:sectPr>
       <w:footnotePr>
         <w:numRestart w:val="eachSect"/>

</xml_diff>